<commit_message>
Points 1,2, and 3
Writing project title, introduction and problem definition,
</commit_message>
<xml_diff>
--- a/ethics form.docx
+++ b/ethics form.docx
@@ -1,6 +1,6 @@
 
 <file path=word/document.xml><?xml version="1.0" encoding="utf-8"?>
-<w:document xmlns:wpc="http://schemas.microsoft.com/office/word/2010/wordprocessingCanvas" xmlns:cx="http://schemas.microsoft.com/office/drawing/2014/chartex" xmlns:cx1="http://schemas.microsoft.com/office/drawing/2015/9/8/chartex" xmlns:cx2="http://schemas.microsoft.com/office/drawing/2015/10/21/chartex" xmlns:cx3="http://schemas.microsoft.com/office/drawing/2016/5/9/chartex" xmlns:cx4="http://schemas.microsoft.com/office/drawing/2016/5/10/chartex" xmlns:cx5="http://schemas.microsoft.com/office/drawing/2016/5/11/chartex" xmlns:cx6="http://schemas.microsoft.com/office/drawing/2016/5/12/chartex" xmlns:cx7="http://schemas.microsoft.com/office/drawing/2016/5/13/chartex" xmlns:cx8="http://schemas.microsoft.com/office/drawing/2016/5/14/chartex" xmlns:mc="http://schemas.openxmlformats.org/markup-compatibility/2006" xmlns:aink="http://schemas.microsoft.com/office/drawing/2016/ink" xmlns:am3d="http://schemas.microsoft.com/office/drawing/2017/model3d" xmlns:o="urn:schemas-microsoft-com:office:office" xmlns:oel="http://schemas.microsoft.com/office/2019/extlst" xmlns:r="http://schemas.openxmlformats.org/officeDocument/2006/relationships" xmlns:m="http://schemas.openxmlformats.org/officeDocument/2006/math" xmlns:v="urn:schemas-microsoft-com:vml" xmlns:wp14="http://schemas.microsoft.com/office/word/2010/wordprocessingDrawing" xmlns:wp="http://schemas.openxmlformats.org/drawingml/2006/wordprocessingDrawing" xmlns:w10="urn:schemas-microsoft-com:office:word" xmlns:w="http://schemas.openxmlformats.org/wordprocessingml/2006/main" xmlns:w14="http://schemas.microsoft.com/office/word/2010/wordml" xmlns:w15="http://schemas.microsoft.com/office/word/2012/wordml" xmlns:w16cex="http://schemas.microsoft.com/office/word/2018/wordml/cex" xmlns:w16cid="http://schemas.microsoft.com/office/word/2016/wordml/cid" xmlns:w16="http://schemas.microsoft.com/office/word/2018/wordml" xmlns:w16sdtdh="http://schemas.microsoft.com/office/word/2020/wordml/sdtdatahash" xmlns:w16se="http://schemas.microsoft.com/office/word/2015/wordml/symex" xmlns:wpg="http://schemas.microsoft.com/office/word/2010/wordprocessingGroup" xmlns:wpi="http://schemas.microsoft.com/office/word/2010/wordprocessingInk" xmlns:wne="http://schemas.microsoft.com/office/word/2006/wordml" xmlns:wps="http://schemas.microsoft.com/office/word/2010/wordprocessingShape" mc:Ignorable="w14 w15 w16se w16cid w16 w16cex w16sdtdh wp14">
+<w:document xmlns:wpc="http://schemas.microsoft.com/office/word/2010/wordprocessingCanvas" xmlns:cx="http://schemas.microsoft.com/office/drawing/2014/chartex" xmlns:cx1="http://schemas.microsoft.com/office/drawing/2015/9/8/chartex" xmlns:cx2="http://schemas.microsoft.com/office/drawing/2015/10/21/chartex" xmlns:cx3="http://schemas.microsoft.com/office/drawing/2016/5/9/chartex" xmlns:cx4="http://schemas.microsoft.com/office/drawing/2016/5/10/chartex" xmlns:cx5="http://schemas.microsoft.com/office/drawing/2016/5/11/chartex" xmlns:cx6="http://schemas.microsoft.com/office/drawing/2016/5/12/chartex" xmlns:cx7="http://schemas.microsoft.com/office/drawing/2016/5/13/chartex" xmlns:cx8="http://schemas.microsoft.com/office/drawing/2016/5/14/chartex" xmlns:mc="http://schemas.openxmlformats.org/markup-compatibility/2006" xmlns:aink="http://schemas.microsoft.com/office/drawing/2016/ink" xmlns:am3d="http://schemas.microsoft.com/office/drawing/2017/model3d" xmlns:o="urn:schemas-microsoft-com:office:office" xmlns:oel="http://schemas.microsoft.com/office/2019/extlst" xmlns:r="http://schemas.openxmlformats.org/officeDocument/2006/relationships" xmlns:m="http://schemas.openxmlformats.org/officeDocument/2006/math" xmlns:v="urn:schemas-microsoft-com:vml" xmlns:wp14="http://schemas.microsoft.com/office/word/2010/wordprocessingDrawing" xmlns:wp="http://schemas.openxmlformats.org/drawingml/2006/wordprocessingDrawing" xmlns:w10="urn:schemas-microsoft-com:office:word" xmlns:w="http://schemas.openxmlformats.org/wordprocessingml/2006/main" xmlns:w14="http://schemas.microsoft.com/office/word/2010/wordml" xmlns:w15="http://schemas.microsoft.com/office/word/2012/wordml" xmlns:w16cex="http://schemas.microsoft.com/office/word/2018/wordml/cex" xmlns:w16cid="http://schemas.microsoft.com/office/word/2016/wordml/cid" xmlns:w16="http://schemas.microsoft.com/office/word/2018/wordml" xmlns:w16du="http://schemas.microsoft.com/office/word/2023/wordml/word16du" xmlns:w16sdtdh="http://schemas.microsoft.com/office/word/2020/wordml/sdtdatahash" xmlns:w16sdtfl="http://schemas.microsoft.com/office/word/2024/wordml/sdtformatlock" xmlns:w16se="http://schemas.microsoft.com/office/word/2015/wordml/symex" xmlns:wpg="http://schemas.microsoft.com/office/word/2010/wordprocessingGroup" xmlns:wpi="http://schemas.microsoft.com/office/word/2010/wordprocessingInk" xmlns:wne="http://schemas.microsoft.com/office/word/2006/wordml" xmlns:wps="http://schemas.microsoft.com/office/word/2010/wordprocessingShape" mc:Ignorable="w14 w15 w16se w16cid w16 w16cex w16sdtdh w16sdtfl w16du wp14">
   <w:body>
     <w:p>
       <w:pPr>
@@ -53,15 +53,7 @@
         <w:t>e capstone project</w:t>
       </w:r>
       <w:r>
-        <w:t xml:space="preserve">, please carefully </w:t>
-      </w:r>
-      <w:proofErr w:type="gramStart"/>
-      <w:r>
-        <w:t>read</w:t>
-      </w:r>
-      <w:proofErr w:type="gramEnd"/>
-      <w:r>
-        <w:t xml:space="preserve"> and understand the following information.</w:t>
+        <w:t>, please carefully read and understand the following information.</w:t>
       </w:r>
     </w:p>
     <w:p>
@@ -161,13 +153,8 @@
         <w:t>on the models themselves and the dataset without delving into social work</w:t>
       </w:r>
       <w:r>
-        <w:t xml:space="preserve">, </w:t>
-      </w:r>
-      <w:proofErr w:type="gramStart"/>
-      <w:r>
-        <w:t>bias</w:t>
-      </w:r>
-      <w:proofErr w:type="gramEnd"/>
+        <w:t>, bias</w:t>
+      </w:r>
       <w:r>
         <w:t xml:space="preserve"> or anthropology. Use deductive reasoning on the model outcomes.</w:t>
       </w:r>
@@ -213,13 +200,8 @@
             <w:tcW w:w="7761" w:type="dxa"/>
           </w:tcPr>
           <w:p>
-            <w:proofErr w:type="gramStart"/>
             <w:r>
-              <w:t>As a student researcher, your responsibilities</w:t>
-            </w:r>
-            <w:proofErr w:type="gramEnd"/>
-            <w:r>
-              <w:t xml:space="preserve"> include:</w:t>
+              <w:t>As a student researcher, your responsibilities include:</w:t>
             </w:r>
           </w:p>
         </w:tc>
@@ -232,7 +214,11 @@
           <w:tcPr>
             <w:tcW w:w="625" w:type="dxa"/>
           </w:tcPr>
-          <w:p/>
+          <w:p>
+            <w:r>
+              <w:t>Yes</w:t>
+            </w:r>
+          </w:p>
         </w:tc>
         <w:tc>
           <w:tcPr>
@@ -259,7 +245,11 @@
           <w:tcPr>
             <w:tcW w:w="625" w:type="dxa"/>
           </w:tcPr>
-          <w:p/>
+          <w:p>
+            <w:r>
+              <w:t>Yes</w:t>
+            </w:r>
+          </w:p>
         </w:tc>
         <w:tc>
           <w:tcPr>
@@ -286,7 +276,11 @@
           <w:tcPr>
             <w:tcW w:w="625" w:type="dxa"/>
           </w:tcPr>
-          <w:p/>
+          <w:p>
+            <w:r>
+              <w:t>Yes</w:t>
+            </w:r>
+          </w:p>
         </w:tc>
         <w:tc>
           <w:tcPr>
@@ -313,7 +307,11 @@
           <w:tcPr>
             <w:tcW w:w="625" w:type="dxa"/>
           </w:tcPr>
-          <w:p/>
+          <w:p>
+            <w:r>
+              <w:t>Yes</w:t>
+            </w:r>
+          </w:p>
         </w:tc>
         <w:tc>
           <w:tcPr>
@@ -336,15 +334,7 @@
     <w:p/>
     <w:p>
       <w:r>
-        <w:t xml:space="preserve">I have read and understood the information provided in this ethics form, and I agree as a student researcher to abide by the ethics outlined in this form in the capstone project. I understand that my role will focus on machine learning models and dataset analysis and will not involve social work, health and care, vulnerable social </w:t>
-      </w:r>
-      <w:proofErr w:type="gramStart"/>
-      <w:r>
-        <w:t>groups</w:t>
-      </w:r>
-      <w:proofErr w:type="gramEnd"/>
-      <w:r>
-        <w:t xml:space="preserve"> or anthropology</w:t>
+        <w:t>I have read and understood the information provided in this ethics form, and I agree as a student researcher to abide by the ethics outlined in this form in the capstone project. I understand that my role will focus on machine learning models and dataset analysis and will not involve social work, health and care, vulnerable social groups or anthropology</w:t>
       </w:r>
       <w:r>
         <w:t xml:space="preserve"> (no personal interviews of human subjects)</w:t>
@@ -382,25 +372,37 @@
     <w:p/>
     <w:p>
       <w:r>
-        <w:t>Student Name (printed): __________________________</w:t>
+        <w:t xml:space="preserve">Student Name (printed): </w:t>
+      </w:r>
+      <w:r>
+        <w:t>Leonardo Tarulli</w:t>
       </w:r>
     </w:p>
     <w:p/>
     <w:p>
       <w:r>
-        <w:t>Student Number: _______________________________</w:t>
+        <w:t xml:space="preserve">Student Number: </w:t>
+      </w:r>
+      <w:r>
+        <w:t>25074</w:t>
       </w:r>
     </w:p>
     <w:p/>
     <w:p>
       <w:r>
-        <w:t>Student Signature: __________________________</w:t>
+        <w:t xml:space="preserve">Student Signature: </w:t>
+      </w:r>
+      <w:r>
+        <w:t>Leonardo Tarulli</w:t>
       </w:r>
     </w:p>
     <w:p/>
     <w:p>
       <w:r>
-        <w:t>Date: __________________________</w:t>
+        <w:t xml:space="preserve">Date: </w:t>
+      </w:r>
+      <w:r>
+        <w:t>08/10/2026</w:t>
       </w:r>
     </w:p>
     <w:sectPr>
@@ -414,7 +416,7 @@
 </file>
 
 <file path=word/numbering.xml><?xml version="1.0" encoding="utf-8"?>
-<w:numbering xmlns:wpc="http://schemas.microsoft.com/office/word/2010/wordprocessingCanvas" xmlns:cx="http://schemas.microsoft.com/office/drawing/2014/chartex" xmlns:cx1="http://schemas.microsoft.com/office/drawing/2015/9/8/chartex" xmlns:cx2="http://schemas.microsoft.com/office/drawing/2015/10/21/chartex" xmlns:cx3="http://schemas.microsoft.com/office/drawing/2016/5/9/chartex" xmlns:cx4="http://schemas.microsoft.com/office/drawing/2016/5/10/chartex" xmlns:cx5="http://schemas.microsoft.com/office/drawing/2016/5/11/chartex" xmlns:cx6="http://schemas.microsoft.com/office/drawing/2016/5/12/chartex" xmlns:cx7="http://schemas.microsoft.com/office/drawing/2016/5/13/chartex" xmlns:cx8="http://schemas.microsoft.com/office/drawing/2016/5/14/chartex" xmlns:mc="http://schemas.openxmlformats.org/markup-compatibility/2006" xmlns:aink="http://schemas.microsoft.com/office/drawing/2016/ink" xmlns:am3d="http://schemas.microsoft.com/office/drawing/2017/model3d" xmlns:o="urn:schemas-microsoft-com:office:office" xmlns:oel="http://schemas.microsoft.com/office/2019/extlst" xmlns:r="http://schemas.openxmlformats.org/officeDocument/2006/relationships" xmlns:m="http://schemas.openxmlformats.org/officeDocument/2006/math" xmlns:v="urn:schemas-microsoft-com:vml" xmlns:wp14="http://schemas.microsoft.com/office/word/2010/wordprocessingDrawing" xmlns:wp="http://schemas.openxmlformats.org/drawingml/2006/wordprocessingDrawing" xmlns:w10="urn:schemas-microsoft-com:office:word" xmlns:w="http://schemas.openxmlformats.org/wordprocessingml/2006/main" xmlns:w14="http://schemas.microsoft.com/office/word/2010/wordml" xmlns:w15="http://schemas.microsoft.com/office/word/2012/wordml" xmlns:w16cex="http://schemas.microsoft.com/office/word/2018/wordml/cex" xmlns:w16cid="http://schemas.microsoft.com/office/word/2016/wordml/cid" xmlns:w16="http://schemas.microsoft.com/office/word/2018/wordml" xmlns:w16sdtdh="http://schemas.microsoft.com/office/word/2020/wordml/sdtdatahash" xmlns:w16se="http://schemas.microsoft.com/office/word/2015/wordml/symex" xmlns:wpg="http://schemas.microsoft.com/office/word/2010/wordprocessingGroup" xmlns:wpi="http://schemas.microsoft.com/office/word/2010/wordprocessingInk" xmlns:wne="http://schemas.microsoft.com/office/word/2006/wordml" xmlns:wps="http://schemas.microsoft.com/office/word/2010/wordprocessingShape" mc:Ignorable="w14 w15 w16se w16cid w16 w16cex w16sdtdh wp14">
+<w:numbering xmlns:wpc="http://schemas.microsoft.com/office/word/2010/wordprocessingCanvas" xmlns:cx="http://schemas.microsoft.com/office/drawing/2014/chartex" xmlns:cx1="http://schemas.microsoft.com/office/drawing/2015/9/8/chartex" xmlns:cx2="http://schemas.microsoft.com/office/drawing/2015/10/21/chartex" xmlns:cx3="http://schemas.microsoft.com/office/drawing/2016/5/9/chartex" xmlns:cx4="http://schemas.microsoft.com/office/drawing/2016/5/10/chartex" xmlns:cx5="http://schemas.microsoft.com/office/drawing/2016/5/11/chartex" xmlns:cx6="http://schemas.microsoft.com/office/drawing/2016/5/12/chartex" xmlns:cx7="http://schemas.microsoft.com/office/drawing/2016/5/13/chartex" xmlns:cx8="http://schemas.microsoft.com/office/drawing/2016/5/14/chartex" xmlns:mc="http://schemas.openxmlformats.org/markup-compatibility/2006" xmlns:aink="http://schemas.microsoft.com/office/drawing/2016/ink" xmlns:am3d="http://schemas.microsoft.com/office/drawing/2017/model3d" xmlns:o="urn:schemas-microsoft-com:office:office" xmlns:oel="http://schemas.microsoft.com/office/2019/extlst" xmlns:r="http://schemas.openxmlformats.org/officeDocument/2006/relationships" xmlns:m="http://schemas.openxmlformats.org/officeDocument/2006/math" xmlns:v="urn:schemas-microsoft-com:vml" xmlns:wp14="http://schemas.microsoft.com/office/word/2010/wordprocessingDrawing" xmlns:wp="http://schemas.openxmlformats.org/drawingml/2006/wordprocessingDrawing" xmlns:w10="urn:schemas-microsoft-com:office:word" xmlns:w="http://schemas.openxmlformats.org/wordprocessingml/2006/main" xmlns:w14="http://schemas.microsoft.com/office/word/2010/wordml" xmlns:w15="http://schemas.microsoft.com/office/word/2012/wordml" xmlns:w16cex="http://schemas.microsoft.com/office/word/2018/wordml/cex" xmlns:w16cid="http://schemas.microsoft.com/office/word/2016/wordml/cid" xmlns:w16="http://schemas.microsoft.com/office/word/2018/wordml" xmlns:w16du="http://schemas.microsoft.com/office/word/2023/wordml/word16du" xmlns:w16sdtdh="http://schemas.microsoft.com/office/word/2020/wordml/sdtdatahash" xmlns:w16sdtfl="http://schemas.microsoft.com/office/word/2024/wordml/sdtformatlock" xmlns:w16se="http://schemas.microsoft.com/office/word/2015/wordml/symex" xmlns:wpg="http://schemas.microsoft.com/office/word/2010/wordprocessingGroup" xmlns:wpi="http://schemas.microsoft.com/office/word/2010/wordprocessingInk" xmlns:wne="http://schemas.microsoft.com/office/word/2006/wordml" xmlns:wps="http://schemas.microsoft.com/office/word/2010/wordprocessingShape" mc:Ignorable="w14 w15 w16se w16cid w16 w16cex w16sdtdh w16sdtfl w16du wp14">
   <w:abstractNum w:abstractNumId="0" w15:restartNumberingAfterBreak="0">
     <w:nsid w:val="233732C2"/>
     <w:multiLevelType w:val="hybridMultilevel"/>
@@ -827,7 +829,7 @@
 </file>
 
 <file path=word/styles.xml><?xml version="1.0" encoding="utf-8"?>
-<w:styles xmlns:mc="http://schemas.openxmlformats.org/markup-compatibility/2006" xmlns:r="http://schemas.openxmlformats.org/officeDocument/2006/relationships" xmlns:w="http://schemas.openxmlformats.org/wordprocessingml/2006/main" xmlns:w14="http://schemas.microsoft.com/office/word/2010/wordml" xmlns:w15="http://schemas.microsoft.com/office/word/2012/wordml" xmlns:w16cex="http://schemas.microsoft.com/office/word/2018/wordml/cex" xmlns:w16cid="http://schemas.microsoft.com/office/word/2016/wordml/cid" xmlns:w16="http://schemas.microsoft.com/office/word/2018/wordml" xmlns:w16sdtdh="http://schemas.microsoft.com/office/word/2020/wordml/sdtdatahash" xmlns:w16se="http://schemas.microsoft.com/office/word/2015/wordml/symex" mc:Ignorable="w14 w15 w16se w16cid w16 w16cex w16sdtdh">
+<w:styles xmlns:mc="http://schemas.openxmlformats.org/markup-compatibility/2006" xmlns:r="http://schemas.openxmlformats.org/officeDocument/2006/relationships" xmlns:w="http://schemas.openxmlformats.org/wordprocessingml/2006/main" xmlns:w14="http://schemas.microsoft.com/office/word/2010/wordml" xmlns:w15="http://schemas.microsoft.com/office/word/2012/wordml" xmlns:w16cex="http://schemas.microsoft.com/office/word/2018/wordml/cex" xmlns:w16cid="http://schemas.microsoft.com/office/word/2016/wordml/cid" xmlns:w16="http://schemas.microsoft.com/office/word/2018/wordml" xmlns:w16du="http://schemas.microsoft.com/office/word/2023/wordml/word16du" xmlns:w16sdtdh="http://schemas.microsoft.com/office/word/2020/wordml/sdtdatahash" xmlns:w16sdtfl="http://schemas.microsoft.com/office/word/2024/wordml/sdtformatlock" xmlns:w16se="http://schemas.microsoft.com/office/word/2015/wordml/symex" mc:Ignorable="w14 w15 w16se w16cid w16 w16cex w16sdtdh w16sdtfl w16du">
   <w:docDefaults>
     <w:rPrDefault>
       <w:rPr>

</xml_diff>

<commit_message>
Commit 9: Checked for grammatical mistakes
Today, 25/10/2026, I checked for grammatical mistakes, commas, punctuation and polished some texts.
</commit_message>
<xml_diff>
--- a/ethics form.docx
+++ b/ethics form.docx
@@ -214,11 +214,7 @@
           <w:tcPr>
             <w:tcW w:w="625" w:type="dxa"/>
           </w:tcPr>
-          <w:p>
-            <w:r>
-              <w:t>Yes</w:t>
-            </w:r>
-          </w:p>
+          <w:p/>
         </w:tc>
         <w:tc>
           <w:tcPr>
@@ -245,11 +241,7 @@
           <w:tcPr>
             <w:tcW w:w="625" w:type="dxa"/>
           </w:tcPr>
-          <w:p>
-            <w:r>
-              <w:t>Yes</w:t>
-            </w:r>
-          </w:p>
+          <w:p/>
         </w:tc>
         <w:tc>
           <w:tcPr>
@@ -276,11 +268,7 @@
           <w:tcPr>
             <w:tcW w:w="625" w:type="dxa"/>
           </w:tcPr>
-          <w:p>
-            <w:r>
-              <w:t>Yes</w:t>
-            </w:r>
-          </w:p>
+          <w:p/>
         </w:tc>
         <w:tc>
           <w:tcPr>
@@ -307,11 +295,7 @@
           <w:tcPr>
             <w:tcW w:w="625" w:type="dxa"/>
           </w:tcPr>
-          <w:p>
-            <w:r>
-              <w:t>Yes</w:t>
-            </w:r>
-          </w:p>
+          <w:p/>
         </w:tc>
         <w:tc>
           <w:tcPr>
@@ -374,17 +358,11 @@
       <w:r>
         <w:t xml:space="preserve">Student Name (printed): </w:t>
       </w:r>
-      <w:r>
-        <w:t>Leonardo Tarulli</w:t>
-      </w:r>
     </w:p>
     <w:p/>
     <w:p>
       <w:r>
-        <w:t xml:space="preserve">Student Number: </w:t>
-      </w:r>
-      <w:r>
-        <w:t>25074</w:t>
+        <w:t>Student Number:</w:t>
       </w:r>
     </w:p>
     <w:p/>
@@ -392,17 +370,11 @@
       <w:r>
         <w:t xml:space="preserve">Student Signature: </w:t>
       </w:r>
-      <w:r>
-        <w:t>Leonardo Tarulli</w:t>
-      </w:r>
     </w:p>
     <w:p/>
     <w:p>
       <w:r>
         <w:t xml:space="preserve">Date: </w:t>
-      </w:r>
-      <w:r>
-        <w:t>08/10/2026</w:t>
       </w:r>
     </w:p>
     <w:sectPr>

</xml_diff>